<commit_message>
Ajustes de redaccion en analisis, conclusiones y matriz IREB
</commit_message>
<xml_diff>
--- a/Unidad 1/IREB_Proyectos_Informe_JRFINAL.docx
+++ b/Unidad 1/IREB_Proyectos_Informe_JRFINAL.docx
@@ -6556,7 +6556,7 @@
           <w:rFonts w:ascii="Arial" w:cs="Arial" w:eastAsia="Arial" w:hAnsi="Arial"/>
           <w:rtl w:val="0"/>
         </w:rPr>
-        <w:t xml:space="preserve">Demuestra que la gran mayoría de los requerimientos relevantes se encuentran documentados, con un origen claro derivado de las entrevistas con los actores del restaurante y alineados con los objetivos del negocio. Sin embargo, obtuvo dos respuestas negativas debido a contradicciones puntuales entre los casos de uso (por ejemplo, la asignación y habilitación del estado </w:t>
+        <w:t>Demuestra que la gran mayoría de los requerimientos relevantes se encuentran documentados, con un origen claro derivado de las entrevistas con los actores del restaurante y alineados con los objetivos del negocio. Las dos respuestas negativas corresponden a contradicciones puntuales entre casos de uso, como la asignación del estado "listo para entregar" entre el CU 0-4 de cocina y el CU 0-5 de caja o la búsqueda por número de mesa, que no contempla los pedidos telefónicos, y a la ausencia de un proceso acotado de pruebas. Esta última brecha es propia de la fase en la que avanza el proyecto: con la ERS ya aprobada, el equipo trabaja ahora en el análisis y diseño, y la verificación sobre el producto se abordará en las fases de implementación y pruebas.</w:t>
       </w:r>
       <w:r>
         <w:rPr>
@@ -6565,14 +6565,12 @@
           <w:iCs w:val="1"/>
           <w:rtl w:val="0"/>
         </w:rPr>
-        <w:t xml:space="preserve">"listo para entregar"</w:t>
       </w:r>
       <w:r>
         <w:rPr>
           <w:rFonts w:ascii="Arial" w:cs="Arial" w:eastAsia="Arial" w:hAnsi="Arial"/>
           <w:rtl w:val="0"/>
         </w:rPr>
-        <w:t xml:space="preserve"> entre el CU 0-4 de cocina y el CU 0-5 de caja, o limitaciones en la búsqueda por número de mesa que omiten los pedidos telefónicos) y a la ausencia de un proceso acotado de pruebas. Esta carencia de verificación se debe a que el sistema Bocatto se encuentra estrictamente en la etapa de requisitos y diseño, por lo que aún no existe un producto construido ni pruebas ejecutadas sobre un entorno real.</w:t>
       </w:r>
     </w:p>
     <w:p>
@@ -6612,7 +6610,7 @@
           <w:rFonts w:ascii="Arial" w:cs="Arial" w:eastAsia="Arial" w:hAnsi="Arial"/>
           <w:rtl w:val="0"/>
         </w:rPr>
-        <w:t xml:space="preserve">Refleja una sólida aplicación de los estándares de modelado (AUP / UML), una estructura formal en las especificaciones y el uso de un glosario de términos normalizado. La única no conformidad (NO) se concentra en que algunos requerimientos funcionales no están sujetos a una única interpretación (por ejemplo, el uso de listas abiertas con "por ejemplo" en lugar de secuencias de estados estrictas), lo que puede generar divergencias de criterio entre el equipo de diseño y desarrollo.</w:t>
+        <w:t>Refleja una aplicación sólida del estándar IEEE 830 en la estructura de la ERS, un modelado de casos de uso con notación UML coherente con la metodología AUP y el uso de un glosario de términos normalizado. La única no conformidad se relaciona con la interpretación de los estados del pedido: la descripción del CU 0-4 los presenta como una lista abierta, mientras que el RF-05 los define como una secuencia cerrada. Unificar esa redacción evitará criterios distintos entre los equipos de diseño y desarrollo.</w:t>
       </w:r>
     </w:p>
     <w:p>
@@ -6785,7 +6783,7 @@
           <w:color w:val="000000"/>
           <w:rtl w:val="0"/>
         </w:rPr>
-        <w:t xml:space="preserve">La falta de verificación se explica porque el sistema Bocatto aún no se ha construido. El proyecto se encuentra en la etapa de requisitos, por lo que no existen pruebas ejecutadas ni criterios de aceptación aplicados sobre un producto real; por esta razón, la evaluación se limita a la calidad de la especificación y no a su implementación.</w:t>
+        <w:t>La brecha en verificación responde a la etapa actual del proyecto y no a una debilidad de la especificación. Bocatto cuenta con una ERS aprobada por el cliente y avanza en la fase de análisis y diseño; como el sistema todavía no se ha construido, la comprobación de cada requisito sobre el producto se realizará mediante el plan de pruebas previsto para las siguientes fases, tomando como base las condiciones medibles que ya describe cada requisito.</w:t>
       </w:r>
     </w:p>
     <w:p>

</xml_diff>